<commit_message>
fix(PRE.2–6 v2): doc numbers, disclaimer P2 grammar, its risks, PRE.2.p period
- Add doc_no to each draft so footer/control use PRE/POL/02–06
- Rewrite accreditation-only disclaimer P2 in plain English
- PRE.3.b: its risks; PRE.2.p requirement: terminal full stop
- Re-render all masters and previews

Co-authored-by: upadhyaymehul9-prog <upadhyaymehul9-prog@users.noreply.github.com>
</commit_message>
<xml_diff>
--- a/policies/build/masters/PRE.2_v2_master.docx
+++ b/policies/build/masters/PRE.2_v2_master.docx
@@ -130,7 +130,7 @@
                 <w:sz w:val="18"/>
                 <w:szCs w:val="18"/>
               </w:rPr>
-              <w:t xml:space="preserve">«PRE/POL/00»</w:t>
+              <w:t xml:space="preserve">«PRE/POL/02»</w:t>
             </w:r>
           </w:p>
         </w:tc>
@@ -4353,7 +4353,7 @@
                 <w:sz w:val="18"/>
                 <w:szCs w:val="18"/>
               </w:rPr>
-              <w:t xml:space="preserve">The patient and/or family members are provided multidisciplinary counselling when appropriate</w:t>
+              <w:t xml:space="preserve">The patient and/or family members are provided multidisciplinary counselling when appropriate.</w:t>
             </w:r>
           </w:p>
         </w:tc>
@@ -5587,7 +5587,7 @@
         <w:spacing w:after="100" w:before="220"/>
       </w:pPr>
       <w:r>
-        <w:t xml:space="preserve">PRE.2.p — The patient and/or family members are provided multidisciplinary counselling when appropriate</w:t>
+        <w:t xml:space="preserve">PRE.2.p — The patient and/or family members are provided multidisciplinary counselling when appropriate.</w:t>
       </w:r>
     </w:p>
     <w:p>
@@ -5688,7 +5688,7 @@
           <w:sz w:val="22"/>
           <w:szCs w:val="22"/>
         </w:rPr>
-        <w:t xml:space="preserve">The requirements in this document are accreditation requirements of the NABH SHCO 3rd Edition rather than duties under a named Act of Parliament. In particular those arising under no named Act of Parliament; the duties in this document are accreditation requirements of the NABH SHCO 3rd Edition are written here as accreditation method, not as a copied statute. This policy does not import the Consumer Protection Act, 2019, the Clinical Establishments Act, 2010, or the Mental Healthcare Act, 2017 as a checklist. Statutory duties that arise under other documents of «Hospital Name» remain those documents. «Hospital Name» is responsible for verifying any statutory duty that applies to it; this document does not constitute legal advice.</w:t>
+        <w:t xml:space="preserve">The requirements in this document are accreditation requirements of the NABH SHCO 3rd Edition, not duties under a named Act of Parliament. This policy does not import the Consumer Protection Act, 2019, the Clinical Establishments Act, 2010, or the Mental Healthcare Act, 2017 as a checklist. Statutory duties that arise under other documents of «Hospital Name» remain those documents. «Hospital Name» is responsible for verifying any statutory duty that applies to it; this document does not constitute legal advice.</w:t>
       </w:r>
     </w:p>
     <w:p>
@@ -5780,7 +5780,7 @@
         <w:sz w:val="16"/>
         <w:szCs w:val="16"/>
       </w:rPr>
-      <w:t xml:space="preserve">«Hospital Name»  |  «PRE/POL/00»  |  Controlled document  |  Beliefs, Values and Involvement in Decision-Making</w:t>
+      <w:t xml:space="preserve">«Hospital Name»  |  «PRE/POL/02»  |  Controlled document  |  Beliefs, Values and Involvement in Decision-Making</w:t>
     </w:r>
   </w:p>
 </w:ftr>

</xml_diff>